<commit_message>
chung minh nguoi lam
</commit_message>
<xml_diff>
--- a/LAB4/Lab4_CNPM2_1150080122_NguyenThiBachVien.docx
+++ b/LAB4/Lab4_CNPM2_1150080122_NguyenThiBachVien.docx
@@ -1,6 +1,6 @@
 
 <file path=word/document.xml><?xml version="1.0" encoding="utf-8"?>
-<w:document xmlns:wpc="http://schemas.microsoft.com/office/word/2010/wordprocessingCanvas" xmlns:cx="http://schemas.microsoft.com/office/drawing/2014/chartex" xmlns:cx1="http://schemas.microsoft.com/office/drawing/2015/9/8/chartex" xmlns:cx2="http://schemas.microsoft.com/office/drawing/2015/10/21/chartex" xmlns:cx3="http://schemas.microsoft.com/office/drawing/2016/5/9/chartex" xmlns:cx4="http://schemas.microsoft.com/office/drawing/2016/5/10/chartex" xmlns:cx5="http://schemas.microsoft.com/office/drawing/2016/5/11/chartex" xmlns:cx6="http://schemas.microsoft.com/office/drawing/2016/5/12/chartex" xmlns:cx7="http://schemas.microsoft.com/office/drawing/2016/5/13/chartex" xmlns:cx8="http://schemas.microsoft.com/office/drawing/2016/5/14/chartex" xmlns:mc="http://schemas.openxmlformats.org/markup-compatibility/2006" xmlns:aink="http://schemas.microsoft.com/office/drawing/2016/ink" xmlns:am3d="http://schemas.microsoft.com/office/drawing/2017/model3d" xmlns:o="urn:schemas-microsoft-com:office:office" xmlns:oel="http://schemas.microsoft.com/office/2019/extlst" xmlns:r="http://schemas.openxmlformats.org/officeDocument/2006/relationships" xmlns:m="http://schemas.openxmlformats.org/officeDocument/2006/math" xmlns:v="urn:schemas-microsoft-com:vml" xmlns:wp14="http://schemas.microsoft.com/office/word/2010/wordprocessingDrawing" xmlns:wp="http://schemas.openxmlformats.org/drawingml/2006/wordprocessingDrawing" xmlns:w10="urn:schemas-microsoft-com:office:word" xmlns:w="http://schemas.openxmlformats.org/wordprocessingml/2006/main" xmlns:w14="http://schemas.microsoft.com/office/word/2010/wordml" xmlns:w15="http://schemas.microsoft.com/office/word/2012/wordml" xmlns:w16cex="http://schemas.microsoft.com/office/word/2018/wordml/cex" xmlns:w16cid="http://schemas.microsoft.com/office/word/2016/wordml/cid" xmlns:w16="http://schemas.microsoft.com/office/word/2018/wordml" xmlns:w16sdtdh="http://schemas.microsoft.com/office/word/2020/wordml/sdtdatahash" xmlns:w16se="http://schemas.microsoft.com/office/word/2015/wordml/symex" xmlns:wpg="http://schemas.microsoft.com/office/word/2010/wordprocessingGroup" xmlns:wpi="http://schemas.microsoft.com/office/word/2010/wordprocessingInk" xmlns:wne="http://schemas.microsoft.com/office/word/2006/wordml" xmlns:wps="http://schemas.microsoft.com/office/word/2010/wordprocessingShape" mc:Ignorable="w14 w15 w16se w16cid w16 w16cex w16sdtdh wp14">
+<w:document xmlns:wpc="http://schemas.microsoft.com/office/word/2010/wordprocessingCanvas" xmlns:cx="http://schemas.microsoft.com/office/drawing/2014/chartex" xmlns:cx1="http://schemas.microsoft.com/office/drawing/2015/9/8/chartex" xmlns:cx2="http://schemas.microsoft.com/office/drawing/2015/10/21/chartex" xmlns:cx3="http://schemas.microsoft.com/office/drawing/2016/5/9/chartex" xmlns:cx4="http://schemas.microsoft.com/office/drawing/2016/5/10/chartex" xmlns:cx5="http://schemas.microsoft.com/office/drawing/2016/5/11/chartex" xmlns:cx6="http://schemas.microsoft.com/office/drawing/2016/5/12/chartex" xmlns:cx7="http://schemas.microsoft.com/office/drawing/2016/5/13/chartex" xmlns:cx8="http://schemas.microsoft.com/office/drawing/2016/5/14/chartex" xmlns:mc="http://schemas.openxmlformats.org/markup-compatibility/2006" xmlns:aink="http://schemas.microsoft.com/office/drawing/2016/ink" xmlns:am3d="http://schemas.microsoft.com/office/drawing/2017/model3d" xmlns:o="urn:schemas-microsoft-com:office:office" xmlns:oel="http://schemas.microsoft.com/office/2019/extlst" xmlns:r="http://schemas.openxmlformats.org/officeDocument/2006/relationships" xmlns:m="http://schemas.openxmlformats.org/officeDocument/2006/math" xmlns:v="urn:schemas-microsoft-com:vml" xmlns:wp14="http://schemas.microsoft.com/office/word/2010/wordprocessingDrawing" xmlns:wp="http://schemas.openxmlformats.org/drawingml/2006/wordprocessingDrawing" xmlns:w10="urn:schemas-microsoft-com:office:word" xmlns:w="http://schemas.openxmlformats.org/wordprocessingml/2006/main" xmlns:w14="http://schemas.microsoft.com/office/word/2010/wordml" xmlns:w15="http://schemas.microsoft.com/office/word/2012/wordml" xmlns:w16cex="http://schemas.microsoft.com/office/word/2018/wordml/cex" xmlns:w16cid="http://schemas.microsoft.com/office/word/2016/wordml/cid" xmlns:w16="http://schemas.microsoft.com/office/word/2018/wordml" xmlns:w16du="http://schemas.microsoft.com/office/word/2023/wordml/word16du" xmlns:w16sdtdh="http://schemas.microsoft.com/office/word/2020/wordml/sdtdatahash" xmlns:w16sdtfl="http://schemas.microsoft.com/office/word/2024/wordml/sdtformatlock" xmlns:w16se="http://schemas.microsoft.com/office/word/2015/wordml/symex" xmlns:wpg="http://schemas.microsoft.com/office/word/2010/wordprocessingGroup" xmlns:wpi="http://schemas.microsoft.com/office/word/2010/wordprocessingInk" xmlns:wne="http://schemas.microsoft.com/office/word/2006/wordml" xmlns:wps="http://schemas.microsoft.com/office/word/2010/wordprocessingShape" mc:Ignorable="w14 w15 w16se w16cid w16 w16cex w16sdtdh w16sdtfl w16du wp14">
   <w:body>
     <w:p>
       <w:pPr>
@@ -34,16 +34,19 @@
           <w:szCs w:val="26"/>
         </w:rPr>
       </w:pPr>
-      <w:r>
-        <w:rPr>
-          <w:rFonts w:ascii="Times New Roman" w:hAnsi="Times New Roman" w:cs="Times New Roman"/>
-          <w:b/>
-          <w:bCs/>
-          <w:sz w:val="26"/>
-          <w:szCs w:val="26"/>
-        </w:rPr>
-        <w:t>https://youtu.be/Mq2nGzxDhI8</w:t>
-      </w:r>
+      <w:hyperlink r:id="rId6" w:history="1">
+        <w:r>
+          <w:rPr>
+            <w:rStyle w:val="Hyperlink"/>
+            <w:rFonts w:ascii="Times New Roman" w:hAnsi="Times New Roman" w:cs="Times New Roman"/>
+            <w:b/>
+            <w:bCs/>
+            <w:sz w:val="26"/>
+            <w:szCs w:val="26"/>
+          </w:rPr>
+          <w:t>https://youtu.be/hoBrkUYG9oI</w:t>
+        </w:r>
+      </w:hyperlink>
     </w:p>
     <w:p>
       <w:pPr>
@@ -139,7 +142,7 @@
                     <pic:cNvPicPr/>
                   </pic:nvPicPr>
                   <pic:blipFill>
-                    <a:blip r:embed="rId6">
+                    <a:blip r:embed="rId7">
                       <a:extLst>
                         <a:ext uri="{28A0092B-C50C-407E-A947-70E740481C1C}">
                           <a14:useLocalDpi xmlns:a14="http://schemas.microsoft.com/office/drawing/2010/main" val="0"/>
@@ -197,7 +200,7 @@
                     <pic:cNvPicPr/>
                   </pic:nvPicPr>
                   <pic:blipFill>
-                    <a:blip r:embed="rId7">
+                    <a:blip r:embed="rId8">
                       <a:extLst>
                         <a:ext uri="{28A0092B-C50C-407E-A947-70E740481C1C}">
                           <a14:useLocalDpi xmlns:a14="http://schemas.microsoft.com/office/drawing/2010/main" val="0"/>
@@ -318,7 +321,7 @@
                     <pic:cNvPicPr/>
                   </pic:nvPicPr>
                   <pic:blipFill>
-                    <a:blip r:embed="rId8">
+                    <a:blip r:embed="rId9">
                       <a:extLst>
                         <a:ext uri="{28A0092B-C50C-407E-A947-70E740481C1C}">
                           <a14:useLocalDpi xmlns:a14="http://schemas.microsoft.com/office/drawing/2010/main" val="0"/>
@@ -386,7 +389,7 @@
                     <pic:cNvPicPr/>
                   </pic:nvPicPr>
                   <pic:blipFill>
-                    <a:blip r:embed="rId9">
+                    <a:blip r:embed="rId10">
                       <a:extLst>
                         <a:ext uri="{28A0092B-C50C-407E-A947-70E740481C1C}">
                           <a14:useLocalDpi xmlns:a14="http://schemas.microsoft.com/office/drawing/2010/main" val="0"/>
@@ -444,7 +447,7 @@
                     <pic:cNvPicPr/>
                   </pic:nvPicPr>
                   <pic:blipFill>
-                    <a:blip r:embed="rId10">
+                    <a:blip r:embed="rId11">
                       <a:extLst>
                         <a:ext uri="{28A0092B-C50C-407E-A947-70E740481C1C}">
                           <a14:useLocalDpi xmlns:a14="http://schemas.microsoft.com/office/drawing/2010/main" val="0"/>
@@ -502,7 +505,7 @@
                     <pic:cNvPicPr/>
                   </pic:nvPicPr>
                   <pic:blipFill>
-                    <a:blip r:embed="rId11">
+                    <a:blip r:embed="rId12">
                       <a:extLst>
                         <a:ext uri="{28A0092B-C50C-407E-A947-70E740481C1C}">
                           <a14:useLocalDpi xmlns:a14="http://schemas.microsoft.com/office/drawing/2010/main" val="0"/>
@@ -605,7 +608,7 @@
                     <pic:cNvPicPr/>
                   </pic:nvPicPr>
                   <pic:blipFill>
-                    <a:blip r:embed="rId12">
+                    <a:blip r:embed="rId13">
                       <a:extLst>
                         <a:ext uri="{28A0092B-C50C-407E-A947-70E740481C1C}">
                           <a14:useLocalDpi xmlns:a14="http://schemas.microsoft.com/office/drawing/2010/main" val="0"/>
@@ -1376,7 +1379,7 @@
                     <pic:cNvPicPr/>
                   </pic:nvPicPr>
                   <pic:blipFill>
-                    <a:blip r:embed="rId13">
+                    <a:blip r:embed="rId14">
                       <a:extLst>
                         <a:ext uri="{28A0092B-C50C-407E-A947-70E740481C1C}">
                           <a14:useLocalDpi xmlns:a14="http://schemas.microsoft.com/office/drawing/2010/main" val="0"/>
@@ -1611,7 +1614,7 @@
                     <pic:cNvPicPr/>
                   </pic:nvPicPr>
                   <pic:blipFill>
-                    <a:blip r:embed="rId14">
+                    <a:blip r:embed="rId15">
                       <a:extLst>
                         <a:ext uri="{28A0092B-C50C-407E-A947-70E740481C1C}">
                           <a14:useLocalDpi xmlns:a14="http://schemas.microsoft.com/office/drawing/2010/main" val="0"/>
@@ -2199,25 +2202,7 @@
                 <w:sz w:val="26"/>
                 <w:szCs w:val="26"/>
               </w:rPr>
-              <w:t>00:0C:</w:t>
-            </w:r>
-            <w:proofErr w:type="gramStart"/>
-            <w:r>
-              <w:rPr>
-                <w:rFonts w:ascii="Times New Roman" w:hAnsi="Times New Roman" w:cs="Times New Roman"/>
-                <w:sz w:val="26"/>
-                <w:szCs w:val="26"/>
-              </w:rPr>
-              <w:t>29:FA</w:t>
-            </w:r>
-            <w:proofErr w:type="gramEnd"/>
-            <w:r>
-              <w:rPr>
-                <w:rFonts w:ascii="Times New Roman" w:hAnsi="Times New Roman" w:cs="Times New Roman"/>
-                <w:sz w:val="26"/>
-                <w:szCs w:val="26"/>
-              </w:rPr>
-              <w:t>:DD:2A / VMware</w:t>
+              <w:t>00:0C:29:FA:DD:2A / VMware</w:t>
             </w:r>
           </w:p>
         </w:tc>
@@ -2369,25 +2354,7 @@
                 <w:sz w:val="26"/>
                 <w:szCs w:val="26"/>
               </w:rPr>
-              <w:t>00:0</w:t>
-            </w:r>
-            <w:proofErr w:type="gramStart"/>
-            <w:r>
-              <w:rPr>
-                <w:rFonts w:ascii="Times New Roman" w:hAnsi="Times New Roman" w:cs="Times New Roman"/>
-                <w:sz w:val="26"/>
-                <w:szCs w:val="26"/>
-              </w:rPr>
-              <w:t>C:29:5</w:t>
-            </w:r>
-            <w:proofErr w:type="gramEnd"/>
-            <w:r>
-              <w:rPr>
-                <w:rFonts w:ascii="Times New Roman" w:hAnsi="Times New Roman" w:cs="Times New Roman"/>
-                <w:sz w:val="26"/>
-                <w:szCs w:val="26"/>
-              </w:rPr>
-              <w:t>C:5A:8A / VMware</w:t>
+              <w:t>00:0C:29:5C:5A:8A / VMware</w:t>
             </w:r>
           </w:p>
         </w:tc>
@@ -2847,7 +2814,7 @@
                     <pic:cNvPicPr/>
                   </pic:nvPicPr>
                   <pic:blipFill>
-                    <a:blip r:embed="rId15">
+                    <a:blip r:embed="rId16">
                       <a:extLst>
                         <a:ext uri="{28A0092B-C50C-407E-A947-70E740481C1C}">
                           <a14:useLocalDpi xmlns:a14="http://schemas.microsoft.com/office/drawing/2010/main" val="0"/>
@@ -3724,7 +3691,7 @@
                     <pic:cNvPicPr/>
                   </pic:nvPicPr>
                   <pic:blipFill>
-                    <a:blip r:embed="rId16">
+                    <a:blip r:embed="rId17">
                       <a:extLst>
                         <a:ext uri="{28A0092B-C50C-407E-A947-70E740481C1C}">
                           <a14:useLocalDpi xmlns:a14="http://schemas.microsoft.com/office/drawing/2010/main" val="0"/>
@@ -5849,7 +5816,6 @@
                 <w:szCs w:val="26"/>
               </w:rPr>
             </w:pPr>
-            <w:proofErr w:type="spellStart"/>
             <w:r>
               <w:rPr>
                 <w:rStyle w:val="Strong"/>
@@ -5860,19 +5826,7 @@
                 <w:szCs w:val="26"/>
               </w:rPr>
               <w:lastRenderedPageBreak/>
-              <w:t>Quyền</w:t>
-            </w:r>
-            <w:proofErr w:type="spellEnd"/>
-            <w:r>
-              <w:rPr>
-                <w:rStyle w:val="Strong"/>
-                <w:rFonts w:ascii="Times New Roman" w:hAnsi="Times New Roman" w:cs="Times New Roman"/>
-                <w:b w:val="0"/>
-                <w:bCs w:val="0"/>
-                <w:sz w:val="26"/>
-                <w:szCs w:val="26"/>
-              </w:rPr>
-              <w:t xml:space="preserve"> </w:t>
+              <w:t xml:space="preserve">Quyền </w:t>
             </w:r>
             <w:proofErr w:type="spellStart"/>
             <w:r>
@@ -6758,7 +6712,7 @@
                     <pic:cNvPicPr/>
                   </pic:nvPicPr>
                   <pic:blipFill>
-                    <a:blip r:embed="rId17">
+                    <a:blip r:embed="rId18">
                       <a:extLst>
                         <a:ext uri="{28A0092B-C50C-407E-A947-70E740481C1C}">
                           <a14:useLocalDpi xmlns:a14="http://schemas.microsoft.com/office/drawing/2010/main" val="0"/>
@@ -6817,7 +6771,7 @@
                     <pic:cNvPicPr/>
                   </pic:nvPicPr>
                   <pic:blipFill>
-                    <a:blip r:embed="rId18">
+                    <a:blip r:embed="rId19">
                       <a:extLst>
                         <a:ext uri="{28A0092B-C50C-407E-A947-70E740481C1C}">
                           <a14:useLocalDpi xmlns:a14="http://schemas.microsoft.com/office/drawing/2010/main" val="0"/>
@@ -6875,7 +6829,7 @@
                     <pic:cNvPicPr/>
                   </pic:nvPicPr>
                   <pic:blipFill>
-                    <a:blip r:embed="rId19">
+                    <a:blip r:embed="rId20">
                       <a:extLst>
                         <a:ext uri="{28A0092B-C50C-407E-A947-70E740481C1C}">
                           <a14:useLocalDpi xmlns:a14="http://schemas.microsoft.com/office/drawing/2010/main" val="0"/>
@@ -7633,7 +7587,7 @@
                     <pic:cNvPicPr/>
                   </pic:nvPicPr>
                   <pic:blipFill>
-                    <a:blip r:embed="rId20">
+                    <a:blip r:embed="rId21">
                       <a:extLst>
                         <a:ext uri="{28A0092B-C50C-407E-A947-70E740481C1C}">
                           <a14:useLocalDpi xmlns:a14="http://schemas.microsoft.com/office/drawing/2010/main" val="0"/>
@@ -8769,7 +8723,7 @@
                     <pic:cNvPicPr/>
                   </pic:nvPicPr>
                   <pic:blipFill>
-                    <a:blip r:embed="rId21">
+                    <a:blip r:embed="rId22">
                       <a:extLst>
                         <a:ext uri="{28A0092B-C50C-407E-A947-70E740481C1C}">
                           <a14:useLocalDpi xmlns:a14="http://schemas.microsoft.com/office/drawing/2010/main" val="0"/>
@@ -9890,7 +9844,7 @@
                     <pic:cNvPicPr/>
                   </pic:nvPicPr>
                   <pic:blipFill>
-                    <a:blip r:embed="rId22">
+                    <a:blip r:embed="rId23">
                       <a:extLst>
                         <a:ext uri="{28A0092B-C50C-407E-A947-70E740481C1C}">
                           <a14:useLocalDpi xmlns:a14="http://schemas.microsoft.com/office/drawing/2010/main" val="0"/>
@@ -12348,7 +12302,7 @@
                     <pic:cNvPicPr/>
                   </pic:nvPicPr>
                   <pic:blipFill>
-                    <a:blip r:embed="rId23">
+                    <a:blip r:embed="rId24">
                       <a:extLst>
                         <a:ext uri="{28A0092B-C50C-407E-A947-70E740481C1C}">
                           <a14:useLocalDpi xmlns:a14="http://schemas.microsoft.com/office/drawing/2010/main" val="0"/>
@@ -12620,7 +12574,7 @@
                     <pic:cNvPicPr/>
                   </pic:nvPicPr>
                   <pic:blipFill>
-                    <a:blip r:embed="rId24">
+                    <a:blip r:embed="rId25">
                       <a:extLst>
                         <a:ext uri="{28A0092B-C50C-407E-A947-70E740481C1C}">
                           <a14:useLocalDpi xmlns:a14="http://schemas.microsoft.com/office/drawing/2010/main" val="0"/>
@@ -12683,7 +12637,7 @@
                     <pic:cNvPicPr/>
                   </pic:nvPicPr>
                   <pic:blipFill>
-                    <a:blip r:embed="rId25">
+                    <a:blip r:embed="rId26">
                       <a:extLst>
                         <a:ext uri="{28A0092B-C50C-407E-A947-70E740481C1C}">
                           <a14:useLocalDpi xmlns:a14="http://schemas.microsoft.com/office/drawing/2010/main" val="0"/>
@@ -13959,7 +13913,7 @@
                     <pic:cNvPicPr/>
                   </pic:nvPicPr>
                   <pic:blipFill>
-                    <a:blip r:embed="rId26">
+                    <a:blip r:embed="rId27">
                       <a:extLst>
                         <a:ext uri="{28A0092B-C50C-407E-A947-70E740481C1C}">
                           <a14:useLocalDpi xmlns:a14="http://schemas.microsoft.com/office/drawing/2010/main" val="0"/>
@@ -14067,7 +14021,7 @@
                     <pic:cNvPicPr/>
                   </pic:nvPicPr>
                   <pic:blipFill>
-                    <a:blip r:embed="rId27">
+                    <a:blip r:embed="rId28">
                       <a:extLst>
                         <a:ext uri="{28A0092B-C50C-407E-A947-70E740481C1C}">
                           <a14:useLocalDpi xmlns:a14="http://schemas.microsoft.com/office/drawing/2010/main" val="0"/>
@@ -15553,7 +15507,7 @@
                     <pic:cNvPicPr/>
                   </pic:nvPicPr>
                   <pic:blipFill>
-                    <a:blip r:embed="rId28">
+                    <a:blip r:embed="rId29">
                       <a:extLst>
                         <a:ext uri="{28A0092B-C50C-407E-A947-70E740481C1C}">
                           <a14:useLocalDpi xmlns:a14="http://schemas.microsoft.com/office/drawing/2010/main" val="0"/>
@@ -15661,7 +15615,7 @@
                     <pic:cNvPicPr/>
                   </pic:nvPicPr>
                   <pic:blipFill>
-                    <a:blip r:embed="rId29">
+                    <a:blip r:embed="rId30">
                       <a:extLst>
                         <a:ext uri="{28A0092B-C50C-407E-A947-70E740481C1C}">
                           <a14:useLocalDpi xmlns:a14="http://schemas.microsoft.com/office/drawing/2010/main" val="0"/>
@@ -15816,7 +15770,7 @@
                     <pic:cNvPicPr/>
                   </pic:nvPicPr>
                   <pic:blipFill>
-                    <a:blip r:embed="rId30">
+                    <a:blip r:embed="rId31">
                       <a:extLst>
                         <a:ext uri="{28A0092B-C50C-407E-A947-70E740481C1C}">
                           <a14:useLocalDpi xmlns:a14="http://schemas.microsoft.com/office/drawing/2010/main" val="0"/>
@@ -15854,7 +15808,7 @@
 </file>
 
 <file path=word/numbering.xml><?xml version="1.0" encoding="utf-8"?>
-<w:numbering xmlns:wpc="http://schemas.microsoft.com/office/word/2010/wordprocessingCanvas" xmlns:cx="http://schemas.microsoft.com/office/drawing/2014/chartex" xmlns:cx1="http://schemas.microsoft.com/office/drawing/2015/9/8/chartex" xmlns:cx2="http://schemas.microsoft.com/office/drawing/2015/10/21/chartex" xmlns:cx3="http://schemas.microsoft.com/office/drawing/2016/5/9/chartex" xmlns:cx4="http://schemas.microsoft.com/office/drawing/2016/5/10/chartex" xmlns:cx5="http://schemas.microsoft.com/office/drawing/2016/5/11/chartex" xmlns:cx6="http://schemas.microsoft.com/office/drawing/2016/5/12/chartex" xmlns:cx7="http://schemas.microsoft.com/office/drawing/2016/5/13/chartex" xmlns:cx8="http://schemas.microsoft.com/office/drawing/2016/5/14/chartex" xmlns:mc="http://schemas.openxmlformats.org/markup-compatibility/2006" xmlns:aink="http://schemas.microsoft.com/office/drawing/2016/ink" xmlns:am3d="http://schemas.microsoft.com/office/drawing/2017/model3d" xmlns:o="urn:schemas-microsoft-com:office:office" xmlns:oel="http://schemas.microsoft.com/office/2019/extlst" xmlns:r="http://schemas.openxmlformats.org/officeDocument/2006/relationships" xmlns:m="http://schemas.openxmlformats.org/officeDocument/2006/math" xmlns:v="urn:schemas-microsoft-com:vml" xmlns:wp14="http://schemas.microsoft.com/office/word/2010/wordprocessingDrawing" xmlns:wp="http://schemas.openxmlformats.org/drawingml/2006/wordprocessingDrawing" xmlns:w10="urn:schemas-microsoft-com:office:word" xmlns:w="http://schemas.openxmlformats.org/wordprocessingml/2006/main" xmlns:w14="http://schemas.microsoft.com/office/word/2010/wordml" xmlns:w15="http://schemas.microsoft.com/office/word/2012/wordml" xmlns:w16cex="http://schemas.microsoft.com/office/word/2018/wordml/cex" xmlns:w16cid="http://schemas.microsoft.com/office/word/2016/wordml/cid" xmlns:w16="http://schemas.microsoft.com/office/word/2018/wordml" xmlns:w16sdtdh="http://schemas.microsoft.com/office/word/2020/wordml/sdtdatahash" xmlns:w16se="http://schemas.microsoft.com/office/word/2015/wordml/symex" xmlns:wpg="http://schemas.microsoft.com/office/word/2010/wordprocessingGroup" xmlns:wpi="http://schemas.microsoft.com/office/word/2010/wordprocessingInk" xmlns:wne="http://schemas.microsoft.com/office/word/2006/wordml" xmlns:wps="http://schemas.microsoft.com/office/word/2010/wordprocessingShape" mc:Ignorable="w14 w15 w16se w16cid w16 w16cex w16sdtdh wp14">
+<w:numbering xmlns:wpc="http://schemas.microsoft.com/office/word/2010/wordprocessingCanvas" xmlns:cx="http://schemas.microsoft.com/office/drawing/2014/chartex" xmlns:cx1="http://schemas.microsoft.com/office/drawing/2015/9/8/chartex" xmlns:cx2="http://schemas.microsoft.com/office/drawing/2015/10/21/chartex" xmlns:cx3="http://schemas.microsoft.com/office/drawing/2016/5/9/chartex" xmlns:cx4="http://schemas.microsoft.com/office/drawing/2016/5/10/chartex" xmlns:cx5="http://schemas.microsoft.com/office/drawing/2016/5/11/chartex" xmlns:cx6="http://schemas.microsoft.com/office/drawing/2016/5/12/chartex" xmlns:cx7="http://schemas.microsoft.com/office/drawing/2016/5/13/chartex" xmlns:cx8="http://schemas.microsoft.com/office/drawing/2016/5/14/chartex" xmlns:mc="http://schemas.openxmlformats.org/markup-compatibility/2006" xmlns:aink="http://schemas.microsoft.com/office/drawing/2016/ink" xmlns:am3d="http://schemas.microsoft.com/office/drawing/2017/model3d" xmlns:o="urn:schemas-microsoft-com:office:office" xmlns:oel="http://schemas.microsoft.com/office/2019/extlst" xmlns:r="http://schemas.openxmlformats.org/officeDocument/2006/relationships" xmlns:m="http://schemas.openxmlformats.org/officeDocument/2006/math" xmlns:v="urn:schemas-microsoft-com:vml" xmlns:wp14="http://schemas.microsoft.com/office/word/2010/wordprocessingDrawing" xmlns:wp="http://schemas.openxmlformats.org/drawingml/2006/wordprocessingDrawing" xmlns:w10="urn:schemas-microsoft-com:office:word" xmlns:w="http://schemas.openxmlformats.org/wordprocessingml/2006/main" xmlns:w14="http://schemas.microsoft.com/office/word/2010/wordml" xmlns:w15="http://schemas.microsoft.com/office/word/2012/wordml" xmlns:w16cex="http://schemas.microsoft.com/office/word/2018/wordml/cex" xmlns:w16cid="http://schemas.microsoft.com/office/word/2016/wordml/cid" xmlns:w16="http://schemas.microsoft.com/office/word/2018/wordml" xmlns:w16du="http://schemas.microsoft.com/office/word/2023/wordml/word16du" xmlns:w16sdtdh="http://schemas.microsoft.com/office/word/2020/wordml/sdtdatahash" xmlns:w16sdtfl="http://schemas.microsoft.com/office/word/2024/wordml/sdtformatlock" xmlns:w16se="http://schemas.microsoft.com/office/word/2015/wordml/symex" xmlns:wpg="http://schemas.microsoft.com/office/word/2010/wordprocessingGroup" xmlns:wpi="http://schemas.microsoft.com/office/word/2010/wordprocessingInk" xmlns:wne="http://schemas.microsoft.com/office/word/2006/wordml" xmlns:wps="http://schemas.microsoft.com/office/word/2010/wordprocessingShape" mc:Ignorable="w14 w15 w16se w16cid w16 w16cex w16sdtdh w16sdtfl w16du wp14">
   <w:abstractNum w:abstractNumId="0" w15:restartNumberingAfterBreak="0">
     <w:nsid w:val="03DC3B9F"/>
     <w:multiLevelType w:val="hybridMultilevel"/>
@@ -15975,7 +15929,7 @@
 </file>
 
 <file path=word/styles.xml><?xml version="1.0" encoding="utf-8"?>
-<w:styles xmlns:mc="http://schemas.openxmlformats.org/markup-compatibility/2006" xmlns:r="http://schemas.openxmlformats.org/officeDocument/2006/relationships" xmlns:w="http://schemas.openxmlformats.org/wordprocessingml/2006/main" xmlns:w14="http://schemas.microsoft.com/office/word/2010/wordml" xmlns:w15="http://schemas.microsoft.com/office/word/2012/wordml" xmlns:w16cex="http://schemas.microsoft.com/office/word/2018/wordml/cex" xmlns:w16cid="http://schemas.microsoft.com/office/word/2016/wordml/cid" xmlns:w16="http://schemas.microsoft.com/office/word/2018/wordml" xmlns:w16sdtdh="http://schemas.microsoft.com/office/word/2020/wordml/sdtdatahash" xmlns:w16se="http://schemas.microsoft.com/office/word/2015/wordml/symex" mc:Ignorable="w14 w15 w16se w16cid w16 w16cex w16sdtdh">
+<w:styles xmlns:mc="http://schemas.openxmlformats.org/markup-compatibility/2006" xmlns:r="http://schemas.openxmlformats.org/officeDocument/2006/relationships" xmlns:w="http://schemas.openxmlformats.org/wordprocessingml/2006/main" xmlns:w14="http://schemas.microsoft.com/office/word/2010/wordml" xmlns:w15="http://schemas.microsoft.com/office/word/2012/wordml" xmlns:w16cex="http://schemas.microsoft.com/office/word/2018/wordml/cex" xmlns:w16cid="http://schemas.microsoft.com/office/word/2016/wordml/cid" xmlns:w16="http://schemas.microsoft.com/office/word/2018/wordml" xmlns:w16du="http://schemas.microsoft.com/office/word/2023/wordml/word16du" xmlns:w16sdtdh="http://schemas.microsoft.com/office/word/2020/wordml/sdtdatahash" xmlns:w16sdtfl="http://schemas.microsoft.com/office/word/2024/wordml/sdtformatlock" xmlns:w16se="http://schemas.microsoft.com/office/word/2015/wordml/symex" mc:Ignorable="w14 w15 w16se w16cid w16 w16cex w16sdtdh w16sdtfl w16du">
   <w:docDefaults>
     <w:rPrDefault>
       <w:rPr>
@@ -16934,6 +16888,29 @@
       <w:bCs/>
     </w:rPr>
   </w:style>
+  <w:style w:type="character" w:styleId="Hyperlink">
+    <w:name w:val="Hyperlink"/>
+    <w:basedOn w:val="DefaultParagraphFont"/>
+    <w:uiPriority w:val="99"/>
+    <w:unhideWhenUsed/>
+    <w:rsid w:val="00CA5870"/>
+    <w:rPr>
+      <w:color w:val="0563C1" w:themeColor="hyperlink"/>
+      <w:u w:val="single"/>
+    </w:rPr>
+  </w:style>
+  <w:style w:type="character" w:styleId="UnresolvedMention">
+    <w:name w:val="Unresolved Mention"/>
+    <w:basedOn w:val="DefaultParagraphFont"/>
+    <w:uiPriority w:val="99"/>
+    <w:semiHidden/>
+    <w:unhideWhenUsed/>
+    <w:rsid w:val="00CA5870"/>
+    <w:rPr>
+      <w:color w:val="605E5C"/>
+      <w:shd w:val="clear" w:color="auto" w:fill="E1DFDD"/>
+    </w:rPr>
+  </w:style>
 </w:styles>
 </file>
 

</xml_diff>